<commit_message>
Rebuild the client FRS documents
</commit_message>
<xml_diff>
--- a/docs/deliverables/out/Drop-1_Transactional/BRD-05_Accounting_Disbursement_ACSL/BIBS_FRS_BRD-05_Accounting_Disbursement_ACSL_Cover_Note_v1.0.docx
+++ b/docs/deliverables/out/Drop-1_Transactional/BRD-05_Accounting_Disbursement_ACSL/BIBS_FRS_BRD-05_Accounting_Disbursement_ACSL_Cover_Note_v1.0.docx
@@ -1372,7 +1372,7 @@
               <w:rPr>
                 <w:sz w:val="18"/>
               </w:rPr>
-              <w:t>Build, test and UAT preparation</w:t>
+              <w:t>Delivery, test and UAT preparation</w:t>
             </w:r>
           </w:p>
         </w:tc>
@@ -1508,7 +1508,7 @@
       </w:pPr>
       <w:hyperlink w:anchor="_Toc000107" w:history="1">
         <w:r>
-          <w:t xml:space="preserve">2.1 Coverage and gaps</w:t>
+          <w:t xml:space="preserve">2.1 Coverage</w:t>
         </w:r>
         <w:r>
           <w:t xml:space="preserve">	</w:t>
@@ -2369,7 +2369,7 @@
               <w:rPr>
                 <w:sz w:val="18"/>
               </w:rPr>
-              <w:t>Purpose, scope, references, definitions, how to read the FRs, and the table of recorded differences between the built behaviour and the BRD</w:t>
+              <w:t>Purpose, scope, references, definitions and how to read the FRs</w:t>
             </w:r>
           </w:p>
         </w:tc>
@@ -3094,7 +3094,7 @@
               <w:rPr>
                 <w:sz w:val="18"/>
               </w:rPr>
-              <w:t>Every BRD ID to its FR, screen, API and build status, with a coverage summary</w:t>
+              <w:t>Every BRD ID to its FR, screen and test cases, with a coverage summary</w:t>
             </w:r>
           </w:p>
         </w:tc>
@@ -3145,6 +3145,78 @@
               <w:rPr>
                 <w:sz w:val="18"/>
               </w:rPr>
+              <w:t>Proposed business rules and clarifications for confirmation</w:t>
+            </w:r>
+          </w:p>
+        </w:tc>
+        <w:tc>
+          <w:tcPr>
+            <w:tcW w:type="dxa" w:w="6368"/>
+            <w:tcMar>
+              <w:top w:w="50" w:type="dxa"/>
+              <w:bottom w:w="50" w:type="dxa"/>
+              <w:left w:w="90" w:type="dxa"/>
+              <w:right w:w="90" w:type="dxa"/>
+            </w:tcMar>
+            <w:shd w:val="clear" w:color="auto" w:fill="E5F5FF"/>
+          </w:tcPr>
+          <w:p>
+            <w:pPr>
+              <w:pStyle w:val="BDOITable"/>
+            </w:pPr>
+            <w:r>
+              <w:rPr>
+                <w:sz w:val="18"/>
+              </w:rPr>
+              <w:t>Each point where the proposed rule or screen differs from the BRD or needs a decision of BDOI</w:t>
+            </w:r>
+          </w:p>
+        </w:tc>
+      </w:tr>
+      <w:tr>
+        <w:trPr>
+          <w:cantSplit w:val="true"/>
+        </w:trPr>
+        <w:tc>
+          <w:tcPr>
+            <w:tcW w:type="dxa" w:w="601"/>
+            <w:tcMar>
+              <w:top w:w="50" w:type="dxa"/>
+              <w:bottom w:w="50" w:type="dxa"/>
+              <w:left w:w="90" w:type="dxa"/>
+              <w:right w:w="90" w:type="dxa"/>
+            </w:tcMar>
+          </w:tcPr>
+          <w:p>
+            <w:pPr>
+              <w:pStyle w:val="BDOITable"/>
+            </w:pPr>
+            <w:r>
+              <w:rPr>
+                <w:sz w:val="18"/>
+              </w:rPr>
+              <w:t>13</w:t>
+            </w:r>
+          </w:p>
+        </w:tc>
+        <w:tc>
+          <w:tcPr>
+            <w:tcW w:type="dxa" w:w="3004"/>
+            <w:tcMar>
+              <w:top w:w="50" w:type="dxa"/>
+              <w:bottom w:w="50" w:type="dxa"/>
+              <w:left w:w="90" w:type="dxa"/>
+              <w:right w:w="90" w:type="dxa"/>
+            </w:tcMar>
+          </w:tcPr>
+          <w:p>
+            <w:pPr>
+              <w:pStyle w:val="BDOITable"/>
+            </w:pPr>
+            <w:r>
+              <w:rPr>
+                <w:sz w:val="18"/>
+              </w:rPr>
               <w:t>Sign-off</w:t>
             </w:r>
           </w:p>
@@ -3158,7 +3230,6 @@
               <w:left w:w="90" w:type="dxa"/>
               <w:right w:w="90" w:type="dxa"/>
             </w:tcMar>
-            <w:shd w:val="clear" w:color="auto" w:fill="E5F5FF"/>
           </w:tcPr>
           <w:p>
             <w:pPr>
@@ -3239,7 +3310,7 @@
       </w:r>
       <w:r>
         <w:rPr/>
-        <w:t xml:space="preserve"> Validation messages, error codes, lists of values, parameters and permissions are those of the delivered system. A validation done by the screen or the platform shows "-" as code.</w:t>
+        <w:t xml:space="preserve"> Validation messages, error codes, lists of values, parameters and permissions are those shown on the screens. A validation done by the screen or the platform shows "-" as code.</w:t>
       </w:r>
     </w:p>
     <w:p>
@@ -3261,11 +3332,11 @@
         <w:rPr>
           <w:b/>
         </w:rPr>
-        <w:t>Differences.</w:t>
+        <w:t>Clarifications.</w:t>
       </w:r>
       <w:r>
         <w:rPr/>
-        <w:t xml:space="preserve"> Where the delivered behaviour differs from the BRD text, the FR describes the delivered behaviour and a note records the difference; section 1.7 of each volume lists them all.</w:t>
+        <w:t xml:space="preserve"> Where the proposed rule or screen differs from the BRD text or needs a decision of BDOI, the FR says so in a note; chapter 12 of each volume lists each point with the decision requested.</w:t>
       </w:r>
     </w:p>
     <w:p>
@@ -3287,37 +3358,11 @@
         <w:rPr>
           <w:b/>
         </w:rPr>
-        <w:t>Parked items.</w:t>
+        <w:t>Items waiting for BDOI data.</w:t>
       </w:r>
       <w:r>
         <w:rPr/>
-        <w:t xml:space="preserve"> A function that is built but waits for BDOI data (layouts, accounts, lists) is marked "parked" with its open question. The answer is applied as configuration, without a new build, unless the FR says otherwise.</w:t>
-      </w:r>
-    </w:p>
-    <w:p>
-      <w:pPr>
-        <w:tabs>
-          <w:tab w:pos="312" w:val="left"/>
-        </w:tabs>
-        <w:spacing w:after="40"/>
-        <w:ind w:left="312" w:hanging="283"/>
-      </w:pPr>
-      <w:r>
-        <w:rPr>
-          <w:color w:val="004EA8"/>
-        </w:rPr>
-        <w:t>•</w:t>
-        <w:tab/>
-      </w:r>
-      <w:r>
-        <w:rPr>
-          <w:b/>
-        </w:rPr>
-        <w:t>Gaps.</w:t>
-      </w:r>
-      <w:r>
-        <w:rPr/>
-        <w:t xml:space="preserve"> Requirements not met by the delivered system carry a gap number, listed below.</w:t>
+        <w:t xml:space="preserve"> A function that waits for BDOI data (layouts, accounts, lists) names its open question. The answer is applied as configuration, without a change to the system, unless the FR says otherwise.</w:t>
       </w:r>
     </w:p>
     <w:p>
@@ -3368,7 +3413,7 @@
       <w:bookmarkStart w:id="107" w:name="_Toc000107"/>
       <w:r>
         <w:rPr/>
-        <w:t>2.1 Coverage and gaps</w:t>
+        <w:t>2.1 Coverage</w:t>
       </w:r>
       <w:bookmarkEnd w:id="107"/>
     </w:p>
@@ -3406,13 +3451,11 @@
         <w:tblLayout w:type="fixed"/>
       </w:tblPr>
       <w:tblGrid>
-        <w:gridCol w:w="3124"/>
-        <w:gridCol w:w="1141"/>
-        <w:gridCol w:w="1141"/>
-        <w:gridCol w:w="1141"/>
-        <w:gridCol w:w="1201"/>
-        <w:gridCol w:w="1201"/>
-        <w:gridCol w:w="1021"/>
+        <w:gridCol w:w="3899"/>
+        <w:gridCol w:w="1424"/>
+        <w:gridCol w:w="1424"/>
+        <w:gridCol w:w="1424"/>
+        <w:gridCol w:w="1799"/>
       </w:tblGrid>
       <w:tr>
         <w:trPr>
@@ -3421,7 +3464,7 @@
         </w:trPr>
         <w:tc>
           <w:tcPr>
-            <w:tcW w:type="dxa" w:w="3124"/>
+            <w:tcW w:type="dxa" w:w="3899"/>
             <w:shd w:val="clear" w:color="auto" w:fill="004EA8"/>
             <w:tcMar>
               <w:top w:w="50" w:type="dxa"/>
@@ -3447,7 +3490,7 @@
         </w:tc>
         <w:tc>
           <w:tcPr>
-            <w:tcW w:type="dxa" w:w="1141"/>
+            <w:tcW w:type="dxa" w:w="1425"/>
             <w:shd w:val="clear" w:color="auto" w:fill="004EA8"/>
             <w:tcMar>
               <w:top w:w="50" w:type="dxa"/>
@@ -3473,7 +3516,7 @@
         </w:tc>
         <w:tc>
           <w:tcPr>
-            <w:tcW w:type="dxa" w:w="1141"/>
+            <w:tcW w:type="dxa" w:w="1425"/>
             <w:shd w:val="clear" w:color="auto" w:fill="004EA8"/>
             <w:tcMar>
               <w:top w:w="50" w:type="dxa"/>
@@ -3499,85 +3542,7 @@
         </w:tc>
         <w:tc>
           <w:tcPr>
-            <w:tcW w:type="dxa" w:w="1141"/>
-            <w:shd w:val="clear" w:color="auto" w:fill="004EA8"/>
-            <w:tcMar>
-              <w:top w:w="50" w:type="dxa"/>
-              <w:bottom w:w="50" w:type="dxa"/>
-              <w:left w:w="90" w:type="dxa"/>
-              <w:right w:w="90" w:type="dxa"/>
-            </w:tcMar>
-            <w:vAlign w:val="center"/>
-          </w:tcPr>
-          <w:p>
-            <w:pPr>
-              <w:pStyle w:val="BDOITableHeader"/>
-            </w:pPr>
-            <w:r>
-              <w:rPr>
-                <w:b/>
-                <w:color w:val="FFFFFF"/>
-                <w:sz w:val="17"/>
-              </w:rPr>
-              <w:t>Built</w:t>
-            </w:r>
-          </w:p>
-        </w:tc>
-        <w:tc>
-          <w:tcPr>
-            <w:tcW w:type="dxa" w:w="1201"/>
-            <w:shd w:val="clear" w:color="auto" w:fill="004EA8"/>
-            <w:tcMar>
-              <w:top w:w="50" w:type="dxa"/>
-              <w:bottom w:w="50" w:type="dxa"/>
-              <w:left w:w="90" w:type="dxa"/>
-              <w:right w:w="90" w:type="dxa"/>
-            </w:tcMar>
-            <w:vAlign w:val="center"/>
-          </w:tcPr>
-          <w:p>
-            <w:pPr>
-              <w:pStyle w:val="BDOITableHeader"/>
-            </w:pPr>
-            <w:r>
-              <w:rPr>
-                <w:b/>
-                <w:color w:val="FFFFFF"/>
-                <w:sz w:val="17"/>
-              </w:rPr>
-              <w:t>Built, parked</w:t>
-            </w:r>
-          </w:p>
-        </w:tc>
-        <w:tc>
-          <w:tcPr>
-            <w:tcW w:type="dxa" w:w="1201"/>
-            <w:shd w:val="clear" w:color="auto" w:fill="004EA8"/>
-            <w:tcMar>
-              <w:top w:w="50" w:type="dxa"/>
-              <w:bottom w:w="50" w:type="dxa"/>
-              <w:left w:w="90" w:type="dxa"/>
-              <w:right w:w="90" w:type="dxa"/>
-            </w:tcMar>
-            <w:vAlign w:val="center"/>
-          </w:tcPr>
-          <w:p>
-            <w:pPr>
-              <w:pStyle w:val="BDOITableHeader"/>
-            </w:pPr>
-            <w:r>
-              <w:rPr>
-                <w:b/>
-                <w:color w:val="FFFFFF"/>
-                <w:sz w:val="17"/>
-              </w:rPr>
-              <w:t>Built with gap / not built</w:t>
-            </w:r>
-          </w:p>
-        </w:tc>
-        <w:tc>
-          <w:tcPr>
-            <w:tcW w:type="dxa" w:w="1021"/>
+            <w:tcW w:type="dxa" w:w="1425"/>
             <w:shd w:val="clear" w:color="auto" w:fill="004EA8"/>
             <w:tcMar>
               <w:top w:w="50" w:type="dxa"/>
@@ -3601,6 +3566,32 @@
             </w:r>
           </w:p>
         </w:tc>
+        <w:tc>
+          <w:tcPr>
+            <w:tcW w:type="dxa" w:w="1799"/>
+            <w:shd w:val="clear" w:color="auto" w:fill="004EA8"/>
+            <w:tcMar>
+              <w:top w:w="50" w:type="dxa"/>
+              <w:bottom w:w="50" w:type="dxa"/>
+              <w:left w:w="90" w:type="dxa"/>
+              <w:right w:w="90" w:type="dxa"/>
+            </w:tcMar>
+            <w:vAlign w:val="center"/>
+          </w:tcPr>
+          <w:p>
+            <w:pPr>
+              <w:pStyle w:val="BDOITableHeader"/>
+            </w:pPr>
+            <w:r>
+              <w:rPr>
+                <w:b/>
+                <w:color w:val="FFFFFF"/>
+                <w:sz w:val="17"/>
+              </w:rPr>
+              <w:t>Clarifications</w:t>
+            </w:r>
+          </w:p>
+        </w:tc>
       </w:tr>
       <w:tr>
         <w:trPr>
@@ -3608,7 +3599,7 @@
         </w:trPr>
         <w:tc>
           <w:tcPr>
-            <w:tcW w:type="dxa" w:w="3124"/>
+            <w:tcW w:type="dxa" w:w="3899"/>
             <w:tcMar>
               <w:top w:w="50" w:type="dxa"/>
               <w:bottom w:w="50" w:type="dxa"/>
@@ -3630,7 +3621,7 @@
         </w:tc>
         <w:tc>
           <w:tcPr>
-            <w:tcW w:type="dxa" w:w="1141"/>
+            <w:tcW w:type="dxa" w:w="1425"/>
             <w:tcMar>
               <w:top w:w="50" w:type="dxa"/>
               <w:bottom w:w="50" w:type="dxa"/>
@@ -3652,7 +3643,7 @@
         </w:tc>
         <w:tc>
           <w:tcPr>
-            <w:tcW w:type="dxa" w:w="1141"/>
+            <w:tcW w:type="dxa" w:w="1425"/>
             <w:tcMar>
               <w:top w:w="50" w:type="dxa"/>
               <w:bottom w:w="50" w:type="dxa"/>
@@ -3674,7 +3665,7 @@
         </w:tc>
         <w:tc>
           <w:tcPr>
-            <w:tcW w:type="dxa" w:w="1141"/>
+            <w:tcW w:type="dxa" w:w="1425"/>
             <w:tcMar>
               <w:top w:w="50" w:type="dxa"/>
               <w:bottom w:w="50" w:type="dxa"/>
@@ -3690,13 +3681,13 @@
               <w:rPr>
                 <w:sz w:val="17"/>
               </w:rPr>
-              <w:t>66</w:t>
+              <w:t>0</w:t>
             </w:r>
           </w:p>
         </w:tc>
         <w:tc>
           <w:tcPr>
-            <w:tcW w:type="dxa" w:w="1201"/>
+            <w:tcW w:type="dxa" w:w="1799"/>
             <w:tcMar>
               <w:top w:w="50" w:type="dxa"/>
               <w:bottom w:w="50" w:type="dxa"/>
@@ -3716,50 +3707,6 @@
             </w:r>
           </w:p>
         </w:tc>
-        <w:tc>
-          <w:tcPr>
-            <w:tcW w:type="dxa" w:w="1201"/>
-            <w:tcMar>
-              <w:top w:w="50" w:type="dxa"/>
-              <w:bottom w:w="50" w:type="dxa"/>
-              <w:left w:w="90" w:type="dxa"/>
-              <w:right w:w="90" w:type="dxa"/>
-            </w:tcMar>
-          </w:tcPr>
-          <w:p>
-            <w:pPr>
-              <w:pStyle w:val="BDOITable"/>
-            </w:pPr>
-            <w:r>
-              <w:rPr>
-                <w:sz w:val="17"/>
-              </w:rPr>
-              <w:t>5</w:t>
-            </w:r>
-          </w:p>
-        </w:tc>
-        <w:tc>
-          <w:tcPr>
-            <w:tcW w:type="dxa" w:w="1021"/>
-            <w:tcMar>
-              <w:top w:w="50" w:type="dxa"/>
-              <w:bottom w:w="50" w:type="dxa"/>
-              <w:left w:w="90" w:type="dxa"/>
-              <w:right w:w="90" w:type="dxa"/>
-            </w:tcMar>
-          </w:tcPr>
-          <w:p>
-            <w:pPr>
-              <w:pStyle w:val="BDOITable"/>
-            </w:pPr>
-            <w:r>
-              <w:rPr>
-                <w:sz w:val="17"/>
-              </w:rPr>
-              <w:t>0</w:t>
-            </w:r>
-          </w:p>
-        </w:tc>
       </w:tr>
       <w:tr>
         <w:trPr>
@@ -3767,7 +3714,7 @@
         </w:trPr>
         <w:tc>
           <w:tcPr>
-            <w:tcW w:type="dxa" w:w="3124"/>
+            <w:tcW w:type="dxa" w:w="3899"/>
             <w:tcMar>
               <w:top w:w="50" w:type="dxa"/>
               <w:bottom w:w="50" w:type="dxa"/>
@@ -3790,7 +3737,7 @@
         </w:tc>
         <w:tc>
           <w:tcPr>
-            <w:tcW w:type="dxa" w:w="1141"/>
+            <w:tcW w:type="dxa" w:w="1425"/>
             <w:tcMar>
               <w:top w:w="50" w:type="dxa"/>
               <w:bottom w:w="50" w:type="dxa"/>
@@ -3813,7 +3760,7 @@
         </w:tc>
         <w:tc>
           <w:tcPr>
-            <w:tcW w:type="dxa" w:w="1141"/>
+            <w:tcW w:type="dxa" w:w="1425"/>
             <w:tcMar>
               <w:top w:w="50" w:type="dxa"/>
               <w:bottom w:w="50" w:type="dxa"/>
@@ -3836,76 +3783,7 @@
         </w:tc>
         <w:tc>
           <w:tcPr>
-            <w:tcW w:type="dxa" w:w="1141"/>
-            <w:tcMar>
-              <w:top w:w="50" w:type="dxa"/>
-              <w:bottom w:w="50" w:type="dxa"/>
-              <w:left w:w="90" w:type="dxa"/>
-              <w:right w:w="90" w:type="dxa"/>
-            </w:tcMar>
-            <w:shd w:val="clear" w:color="auto" w:fill="E5F5FF"/>
-          </w:tcPr>
-          <w:p>
-            <w:pPr>
-              <w:pStyle w:val="BDOITable"/>
-            </w:pPr>
-            <w:r>
-              <w:rPr>
-                <w:sz w:val="17"/>
-              </w:rPr>
-              <w:t>165</w:t>
-            </w:r>
-          </w:p>
-        </w:tc>
-        <w:tc>
-          <w:tcPr>
-            <w:tcW w:type="dxa" w:w="1201"/>
-            <w:tcMar>
-              <w:top w:w="50" w:type="dxa"/>
-              <w:bottom w:w="50" w:type="dxa"/>
-              <w:left w:w="90" w:type="dxa"/>
-              <w:right w:w="90" w:type="dxa"/>
-            </w:tcMar>
-            <w:shd w:val="clear" w:color="auto" w:fill="E5F5FF"/>
-          </w:tcPr>
-          <w:p>
-            <w:pPr>
-              <w:pStyle w:val="BDOITable"/>
-            </w:pPr>
-            <w:r>
-              <w:rPr>
-                <w:sz w:val="17"/>
-              </w:rPr>
-              <w:t>23</w:t>
-            </w:r>
-          </w:p>
-        </w:tc>
-        <w:tc>
-          <w:tcPr>
-            <w:tcW w:type="dxa" w:w="1201"/>
-            <w:tcMar>
-              <w:top w:w="50" w:type="dxa"/>
-              <w:bottom w:w="50" w:type="dxa"/>
-              <w:left w:w="90" w:type="dxa"/>
-              <w:right w:w="90" w:type="dxa"/>
-            </w:tcMar>
-            <w:shd w:val="clear" w:color="auto" w:fill="E5F5FF"/>
-          </w:tcPr>
-          <w:p>
-            <w:pPr>
-              <w:pStyle w:val="BDOITable"/>
-            </w:pPr>
-            <w:r>
-              <w:rPr>
-                <w:sz w:val="17"/>
-              </w:rPr>
-              <w:t>3</w:t>
-            </w:r>
-          </w:p>
-        </w:tc>
-        <w:tc>
-          <w:tcPr>
-            <w:tcW w:type="dxa" w:w="1021"/>
+            <w:tcW w:type="dxa" w:w="1425"/>
             <w:tcMar>
               <w:top w:w="50" w:type="dxa"/>
               <w:bottom w:w="50" w:type="dxa"/>
@@ -3926,6 +3804,29 @@
             </w:r>
           </w:p>
         </w:tc>
+        <w:tc>
+          <w:tcPr>
+            <w:tcW w:type="dxa" w:w="1799"/>
+            <w:tcMar>
+              <w:top w:w="50" w:type="dxa"/>
+              <w:bottom w:w="50" w:type="dxa"/>
+              <w:left w:w="90" w:type="dxa"/>
+              <w:right w:w="90" w:type="dxa"/>
+            </w:tcMar>
+            <w:shd w:val="clear" w:color="auto" w:fill="E5F5FF"/>
+          </w:tcPr>
+          <w:p>
+            <w:pPr>
+              <w:pStyle w:val="BDOITable"/>
+            </w:pPr>
+            <w:r>
+              <w:rPr>
+                <w:sz w:val="17"/>
+              </w:rPr>
+              <w:t>25</w:t>
+            </w:r>
+          </w:p>
+        </w:tc>
       </w:tr>
       <w:tr>
         <w:trPr>
@@ -3933,7 +3834,7 @@
         </w:trPr>
         <w:tc>
           <w:tcPr>
-            <w:tcW w:type="dxa" w:w="3124"/>
+            <w:tcW w:type="dxa" w:w="3899"/>
             <w:tcMar>
               <w:top w:w="50" w:type="dxa"/>
               <w:bottom w:w="50" w:type="dxa"/>
@@ -3956,7 +3857,7 @@
         </w:tc>
         <w:tc>
           <w:tcPr>
-            <w:tcW w:type="dxa" w:w="1141"/>
+            <w:tcW w:type="dxa" w:w="1425"/>
             <w:tcMar>
               <w:top w:w="50" w:type="dxa"/>
               <w:bottom w:w="50" w:type="dxa"/>
@@ -3979,7 +3880,7 @@
         </w:tc>
         <w:tc>
           <w:tcPr>
-            <w:tcW w:type="dxa" w:w="1141"/>
+            <w:tcW w:type="dxa" w:w="1425"/>
             <w:tcMar>
               <w:top w:w="50" w:type="dxa"/>
               <w:bottom w:w="50" w:type="dxa"/>
@@ -4002,76 +3903,7 @@
         </w:tc>
         <w:tc>
           <w:tcPr>
-            <w:tcW w:type="dxa" w:w="1141"/>
-            <w:tcMar>
-              <w:top w:w="50" w:type="dxa"/>
-              <w:bottom w:w="50" w:type="dxa"/>
-              <w:left w:w="90" w:type="dxa"/>
-              <w:right w:w="90" w:type="dxa"/>
-            </w:tcMar>
-          </w:tcPr>
-          <w:p>
-            <w:pPr>
-              <w:pStyle w:val="BDOITable"/>
-            </w:pPr>
-            <w:r>
-              <w:rPr>
-                <w:b/>
-                <w:sz w:val="17"/>
-              </w:rPr>
-              <w:t>231</w:t>
-            </w:r>
-          </w:p>
-        </w:tc>
-        <w:tc>
-          <w:tcPr>
-            <w:tcW w:type="dxa" w:w="1201"/>
-            <w:tcMar>
-              <w:top w:w="50" w:type="dxa"/>
-              <w:bottom w:w="50" w:type="dxa"/>
-              <w:left w:w="90" w:type="dxa"/>
-              <w:right w:w="90" w:type="dxa"/>
-            </w:tcMar>
-          </w:tcPr>
-          <w:p>
-            <w:pPr>
-              <w:pStyle w:val="BDOITable"/>
-            </w:pPr>
-            <w:r>
-              <w:rPr>
-                <w:b/>
-                <w:sz w:val="17"/>
-              </w:rPr>
-              <w:t>37</w:t>
-            </w:r>
-          </w:p>
-        </w:tc>
-        <w:tc>
-          <w:tcPr>
-            <w:tcW w:type="dxa" w:w="1201"/>
-            <w:tcMar>
-              <w:top w:w="50" w:type="dxa"/>
-              <w:bottom w:w="50" w:type="dxa"/>
-              <w:left w:w="90" w:type="dxa"/>
-              <w:right w:w="90" w:type="dxa"/>
-            </w:tcMar>
-          </w:tcPr>
-          <w:p>
-            <w:pPr>
-              <w:pStyle w:val="BDOITable"/>
-            </w:pPr>
-            <w:r>
-              <w:rPr>
-                <w:b/>
-                <w:sz w:val="17"/>
-              </w:rPr>
-              <w:t>8</w:t>
-            </w:r>
-          </w:p>
-        </w:tc>
-        <w:tc>
-          <w:tcPr>
-            <w:tcW w:type="dxa" w:w="1021"/>
+            <w:tcW w:type="dxa" w:w="1425"/>
             <w:tcMar>
               <w:top w:w="50" w:type="dxa"/>
               <w:bottom w:w="50" w:type="dxa"/>
@@ -4092,169 +3924,9 @@
             </w:r>
           </w:p>
         </w:tc>
-      </w:tr>
-    </w:tbl>
-    <w:p>
-      <w:pPr>
-        <w:pStyle w:val="BDOISpacer"/>
-      </w:pPr>
-    </w:p>
-    <w:p>
-      <w:pPr>
-        <w:pStyle w:val="Caption"/>
-        <w:keepNext/>
-        <w:spacing w:after="60"/>
-      </w:pPr>
-      <w:r>
-        <w:rPr>
-          <w:b/>
-          <w:i w:val="0"/>
-        </w:rPr>
-        <w:t xml:space="preserve">Table 4: </w:t>
-      </w:r>
-      <w:r>
-        <w:rPr/>
-        <w:t>Gaps recorded in the FRS</w:t>
-      </w:r>
-    </w:p>
-    <w:tbl>
-      <w:tblPr>
-        <w:tblW w:type="dxa" w:w="9973"/>
-        <w:jc w:val="center"/>
-        <w:tblLook w:firstColumn="1" w:firstRow="1" w:lastColumn="0" w:lastRow="0" w:noHBand="0" w:noVBand="1" w:val="04A0"/>
-        <w:tblBorders>
-          <w:top w:val="single" w:sz="4" w:space="0" w:color="C2C2C1"/>
-          <w:left w:val="single" w:sz="4" w:space="0" w:color="C2C2C1"/>
-          <w:bottom w:val="single" w:sz="4" w:space="0" w:color="C2C2C1"/>
-          <w:right w:val="single" w:sz="4" w:space="0" w:color="C2C2C1"/>
-          <w:insideH w:val="single" w:sz="4" w:space="0" w:color="C2C2C1"/>
-          <w:insideV w:val="single" w:sz="4" w:space="0" w:color="C2C2C1"/>
-        </w:tblBorders>
-        <w:tblLayout w:type="fixed"/>
-      </w:tblPr>
-      <w:tblGrid>
-        <w:gridCol w:w="841"/>
-        <w:gridCol w:w="4445"/>
-        <w:gridCol w:w="2523"/>
-        <w:gridCol w:w="2162"/>
-      </w:tblGrid>
-      <w:tr>
-        <w:trPr>
-          <w:tblHeader w:val="true"/>
-          <w:cantSplit w:val="true"/>
-        </w:trPr>
         <w:tc>
           <w:tcPr>
-            <w:tcW w:type="dxa" w:w="841"/>
-            <w:shd w:val="clear" w:color="auto" w:fill="004EA8"/>
-            <w:tcMar>
-              <w:top w:w="50" w:type="dxa"/>
-              <w:bottom w:w="50" w:type="dxa"/>
-              <w:left w:w="90" w:type="dxa"/>
-              <w:right w:w="90" w:type="dxa"/>
-            </w:tcMar>
-            <w:vAlign w:val="center"/>
-          </w:tcPr>
-          <w:p>
-            <w:pPr>
-              <w:pStyle w:val="BDOITableHeader"/>
-            </w:pPr>
-            <w:r>
-              <w:rPr>
-                <w:b/>
-                <w:color w:val="FFFFFF"/>
-                <w:sz w:val="17"/>
-              </w:rPr>
-              <w:t>Gap</w:t>
-            </w:r>
-          </w:p>
-        </w:tc>
-        <w:tc>
-          <w:tcPr>
-            <w:tcW w:type="dxa" w:w="4445"/>
-            <w:shd w:val="clear" w:color="auto" w:fill="004EA8"/>
-            <w:tcMar>
-              <w:top w:w="50" w:type="dxa"/>
-              <w:bottom w:w="50" w:type="dxa"/>
-              <w:left w:w="90" w:type="dxa"/>
-              <w:right w:w="90" w:type="dxa"/>
-            </w:tcMar>
-            <w:vAlign w:val="center"/>
-          </w:tcPr>
-          <w:p>
-            <w:pPr>
-              <w:pStyle w:val="BDOITableHeader"/>
-            </w:pPr>
-            <w:r>
-              <w:rPr>
-                <w:b/>
-                <w:color w:val="FFFFFF"/>
-                <w:sz w:val="17"/>
-              </w:rPr>
-              <w:t>Description</w:t>
-            </w:r>
-          </w:p>
-        </w:tc>
-        <w:tc>
-          <w:tcPr>
-            <w:tcW w:type="dxa" w:w="2523"/>
-            <w:shd w:val="clear" w:color="auto" w:fill="004EA8"/>
-            <w:tcMar>
-              <w:top w:w="50" w:type="dxa"/>
-              <w:bottom w:w="50" w:type="dxa"/>
-              <w:left w:w="90" w:type="dxa"/>
-              <w:right w:w="90" w:type="dxa"/>
-            </w:tcMar>
-            <w:vAlign w:val="center"/>
-          </w:tcPr>
-          <w:p>
-            <w:pPr>
-              <w:pStyle w:val="BDOITableHeader"/>
-            </w:pPr>
-            <w:r>
-              <w:rPr>
-                <w:b/>
-                <w:color w:val="FFFFFF"/>
-                <w:sz w:val="17"/>
-              </w:rPr>
-              <w:t>BRD IDs</w:t>
-            </w:r>
-          </w:p>
-        </w:tc>
-        <w:tc>
-          <w:tcPr>
-            <w:tcW w:type="dxa" w:w="2163"/>
-            <w:shd w:val="clear" w:color="auto" w:fill="004EA8"/>
-            <w:tcMar>
-              <w:top w:w="50" w:type="dxa"/>
-              <w:bottom w:w="50" w:type="dxa"/>
-              <w:left w:w="90" w:type="dxa"/>
-              <w:right w:w="90" w:type="dxa"/>
-            </w:tcMar>
-            <w:vAlign w:val="center"/>
-          </w:tcPr>
-          <w:p>
-            <w:pPr>
-              <w:pStyle w:val="BDOITableHeader"/>
-            </w:pPr>
-            <w:r>
-              <w:rPr>
-                <w:b/>
-                <w:color w:val="FFFFFF"/>
-                <w:sz w:val="17"/>
-              </w:rPr>
-              <w:t>Volume</w:t>
-            </w:r>
-          </w:p>
-        </w:tc>
-      </w:tr>
-      <w:tr>
-        <w:trPr>
-          <w:cantSplit w:val="true"/>
-        </w:trPr>
-        <w:tc>
-          <w:tcPr>
-            <w:tcW w:type="dxa" w:w="841"/>
+            <w:tcW w:type="dxa" w:w="1799"/>
             <w:tcMar>
               <w:top w:w="50" w:type="dxa"/>
               <w:bottom w:w="50" w:type="dxa"/>
@@ -4268,362 +3940,10 @@
             </w:pPr>
             <w:r>
               <w:rPr>
+                <w:b/>
                 <w:sz w:val="17"/>
               </w:rPr>
-              <w:t>G1</w:t>
-            </w:r>
-          </w:p>
-        </w:tc>
-        <w:tc>
-          <w:tcPr>
-            <w:tcW w:type="dxa" w:w="4445"/>
-            <w:tcMar>
-              <w:top w:w="50" w:type="dxa"/>
-              <w:bottom w:w="50" w:type="dxa"/>
-              <w:left w:w="90" w:type="dxa"/>
-              <w:right w:w="90" w:type="dxa"/>
-            </w:tcMar>
-          </w:tcPr>
-          <w:p>
-            <w:pPr>
-              <w:pStyle w:val="BDOITable"/>
-            </w:pPr>
-            <w:r>
-              <w:rPr>
-                <w:sz w:val="17"/>
-              </w:rPr>
-              <w:t>The report platform has no Word renderer; the GARD, subsidiaries and Mancom schedules asked in Word are delivered in PDF and Excel</w:t>
-            </w:r>
-          </w:p>
-        </w:tc>
-        <w:tc>
-          <w:tcPr>
-            <w:tcW w:type="dxa" w:w="2523"/>
-            <w:tcMar>
-              <w:top w:w="50" w:type="dxa"/>
-              <w:bottom w:w="50" w:type="dxa"/>
-              <w:left w:w="90" w:type="dxa"/>
-              <w:right w:w="90" w:type="dxa"/>
-            </w:tcMar>
-          </w:tcPr>
-          <w:p>
-            <w:pPr>
-              <w:pStyle w:val="BDOITable"/>
-            </w:pPr>
-            <w:r>
-              <w:rPr>
-                <w:sz w:val="17"/>
-              </w:rPr>
-              <w:t>FRBS 3.2.0</w:t>
-            </w:r>
-          </w:p>
-        </w:tc>
-        <w:tc>
-          <w:tcPr>
-            <w:tcW w:type="dxa" w:w="2163"/>
-            <w:tcMar>
-              <w:top w:w="50" w:type="dxa"/>
-              <w:bottom w:w="50" w:type="dxa"/>
-              <w:left w:w="90" w:type="dxa"/>
-              <w:right w:w="90" w:type="dxa"/>
-            </w:tcMar>
-          </w:tcPr>
-          <w:p>
-            <w:pPr>
-              <w:pStyle w:val="BDOITable"/>
-            </w:pPr>
-            <w:r>
-              <w:rPr>
-                <w:sz w:val="17"/>
-              </w:rPr>
-              <w:t>Volume 1, FR-AC-060</w:t>
-            </w:r>
-          </w:p>
-        </w:tc>
-      </w:tr>
-      <w:tr>
-        <w:trPr>
-          <w:cantSplit w:val="true"/>
-        </w:trPr>
-        <w:tc>
-          <w:tcPr>
-            <w:tcW w:type="dxa" w:w="841"/>
-            <w:tcMar>
-              <w:top w:w="50" w:type="dxa"/>
-              <w:bottom w:w="50" w:type="dxa"/>
-              <w:left w:w="90" w:type="dxa"/>
-              <w:right w:w="90" w:type="dxa"/>
-            </w:tcMar>
-            <w:shd w:val="clear" w:color="auto" w:fill="E5F5FF"/>
-          </w:tcPr>
-          <w:p>
-            <w:pPr>
-              <w:pStyle w:val="BDOITable"/>
-            </w:pPr>
-            <w:r>
-              <w:rPr>
-                <w:sz w:val="17"/>
-              </w:rPr>
-              <w:t>G2</w:t>
-            </w:r>
-          </w:p>
-        </w:tc>
-        <w:tc>
-          <w:tcPr>
-            <w:tcW w:type="dxa" w:w="4445"/>
-            <w:tcMar>
-              <w:top w:w="50" w:type="dxa"/>
-              <w:bottom w:w="50" w:type="dxa"/>
-              <w:left w:w="90" w:type="dxa"/>
-              <w:right w:w="90" w:type="dxa"/>
-            </w:tcMar>
-            <w:shd w:val="clear" w:color="auto" w:fill="E5F5FF"/>
-          </w:tcPr>
-          <w:p>
-            <w:pPr>
-              <w:pStyle w:val="BDOITable"/>
-            </w:pPr>
-            <w:r>
-              <w:rPr>
-                <w:sz w:val="17"/>
-              </w:rPr>
-              <w:t>Return, resubmit and bulk approval of access requests exist in the API only, not in the screens</w:t>
-            </w:r>
-          </w:p>
-        </w:tc>
-        <w:tc>
-          <w:tcPr>
-            <w:tcW w:type="dxa" w:w="2523"/>
-            <w:tcMar>
-              <w:top w:w="50" w:type="dxa"/>
-              <w:bottom w:w="50" w:type="dxa"/>
-              <w:left w:w="90" w:type="dxa"/>
-              <w:right w:w="90" w:type="dxa"/>
-            </w:tcMar>
-            <w:shd w:val="clear" w:color="auto" w:fill="E5F5FF"/>
-          </w:tcPr>
-          <w:p>
-            <w:pPr>
-              <w:pStyle w:val="BDOITable"/>
-            </w:pPr>
-            <w:r>
-              <w:rPr>
-                <w:sz w:val="17"/>
-              </w:rPr>
-              <w:t>BASAU 2.4.1, 2.5.3, 2.6.0, 2.6.1</w:t>
-            </w:r>
-          </w:p>
-        </w:tc>
-        <w:tc>
-          <w:tcPr>
-            <w:tcW w:type="dxa" w:w="2163"/>
-            <w:tcMar>
-              <w:top w:w="50" w:type="dxa"/>
-              <w:bottom w:w="50" w:type="dxa"/>
-              <w:left w:w="90" w:type="dxa"/>
-              <w:right w:w="90" w:type="dxa"/>
-            </w:tcMar>
-            <w:shd w:val="clear" w:color="auto" w:fill="E5F5FF"/>
-          </w:tcPr>
-          <w:p>
-            <w:pPr>
-              <w:pStyle w:val="BDOITable"/>
-            </w:pPr>
-            <w:r>
-              <w:rPr>
-                <w:sz w:val="17"/>
-              </w:rPr>
-              <w:t>Volume 1, FR-AC-072</w:t>
-            </w:r>
-          </w:p>
-        </w:tc>
-      </w:tr>
-      <w:tr>
-        <w:trPr>
-          <w:cantSplit w:val="true"/>
-        </w:trPr>
-        <w:tc>
-          <w:tcPr>
-            <w:tcW w:type="dxa" w:w="841"/>
-            <w:tcMar>
-              <w:top w:w="50" w:type="dxa"/>
-              <w:bottom w:w="50" w:type="dxa"/>
-              <w:left w:w="90" w:type="dxa"/>
-              <w:right w:w="90" w:type="dxa"/>
-            </w:tcMar>
-          </w:tcPr>
-          <w:p>
-            <w:pPr>
-              <w:pStyle w:val="BDOITable"/>
-            </w:pPr>
-            <w:r>
-              <w:rPr>
-                <w:sz w:val="17"/>
-              </w:rPr>
-              <w:t>G3</w:t>
-            </w:r>
-          </w:p>
-        </w:tc>
-        <w:tc>
-          <w:tcPr>
-            <w:tcW w:type="dxa" w:w="4445"/>
-            <w:tcMar>
-              <w:top w:w="50" w:type="dxa"/>
-              <w:bottom w:w="50" w:type="dxa"/>
-              <w:left w:w="90" w:type="dxa"/>
-              <w:right w:w="90" w:type="dxa"/>
-            </w:tcMar>
-          </w:tcPr>
-          <w:p>
-            <w:pPr>
-              <w:pStyle w:val="BDOITable"/>
-            </w:pPr>
-            <w:r>
-              <w:rPr>
-                <w:sz w:val="17"/>
-              </w:rPr>
-              <w:t>ACSL aging and schedule reports per account family are not built; they need eight ageing slots in the ledger</w:t>
-            </w:r>
-          </w:p>
-        </w:tc>
-        <w:tc>
-          <w:tcPr>
-            <w:tcW w:type="dxa" w:w="2523"/>
-            <w:tcMar>
-              <w:top w:w="50" w:type="dxa"/>
-              <w:bottom w:w="50" w:type="dxa"/>
-              <w:left w:w="90" w:type="dxa"/>
-              <w:right w:w="90" w:type="dxa"/>
-            </w:tcMar>
-          </w:tcPr>
-          <w:p>
-            <w:pPr>
-              <w:pStyle w:val="BDOITable"/>
-            </w:pPr>
-            <w:r>
-              <w:rPr>
-                <w:sz w:val="17"/>
-              </w:rPr>
-              <w:t>ACSL 2.14.3, 2.14.4</w:t>
-            </w:r>
-          </w:p>
-        </w:tc>
-        <w:tc>
-          <w:tcPr>
-            <w:tcW w:type="dxa" w:w="2163"/>
-            <w:tcMar>
-              <w:top w:w="50" w:type="dxa"/>
-              <w:bottom w:w="50" w:type="dxa"/>
-              <w:left w:w="90" w:type="dxa"/>
-              <w:right w:w="90" w:type="dxa"/>
-            </w:tcMar>
-          </w:tcPr>
-          <w:p>
-            <w:pPr>
-              <w:pStyle w:val="BDOITable"/>
-            </w:pPr>
-            <w:r>
-              <w:rPr>
-                <w:sz w:val="17"/>
-              </w:rPr>
-              <w:t>Volume 2, FR-AS-005</w:t>
-            </w:r>
-          </w:p>
-        </w:tc>
-      </w:tr>
-      <w:tr>
-        <w:trPr>
-          <w:cantSplit w:val="true"/>
-        </w:trPr>
-        <w:tc>
-          <w:tcPr>
-            <w:tcW w:type="dxa" w:w="841"/>
-            <w:tcMar>
-              <w:top w:w="50" w:type="dxa"/>
-              <w:bottom w:w="50" w:type="dxa"/>
-              <w:left w:w="90" w:type="dxa"/>
-              <w:right w:w="90" w:type="dxa"/>
-            </w:tcMar>
-            <w:shd w:val="clear" w:color="auto" w:fill="E5F5FF"/>
-          </w:tcPr>
-          <w:p>
-            <w:pPr>
-              <w:pStyle w:val="BDOITable"/>
-            </w:pPr>
-            <w:r>
-              <w:rPr>
-                <w:sz w:val="17"/>
-              </w:rPr>
-              <w:t>G4</w:t>
-            </w:r>
-          </w:p>
-        </w:tc>
-        <w:tc>
-          <w:tcPr>
-            <w:tcW w:type="dxa" w:w="4445"/>
-            <w:tcMar>
-              <w:top w:w="50" w:type="dxa"/>
-              <w:bottom w:w="50" w:type="dxa"/>
-              <w:left w:w="90" w:type="dxa"/>
-              <w:right w:w="90" w:type="dxa"/>
-            </w:tcMar>
-            <w:shd w:val="clear" w:color="auto" w:fill="E5F5FF"/>
-          </w:tcPr>
-          <w:p>
-            <w:pPr>
-              <w:pStyle w:val="BDOITable"/>
-            </w:pPr>
-            <w:r>
-              <w:rPr>
-                <w:sz w:val="17"/>
-              </w:rPr>
-              <w:t>The CPC2 incentive report is not built</w:t>
-            </w:r>
-          </w:p>
-        </w:tc>
-        <w:tc>
-          <w:tcPr>
-            <w:tcW w:type="dxa" w:w="2523"/>
-            <w:tcMar>
-              <w:top w:w="50" w:type="dxa"/>
-              <w:bottom w:w="50" w:type="dxa"/>
-              <w:left w:w="90" w:type="dxa"/>
-              <w:right w:w="90" w:type="dxa"/>
-            </w:tcMar>
-            <w:shd w:val="clear" w:color="auto" w:fill="E5F5FF"/>
-          </w:tcPr>
-          <w:p>
-            <w:pPr>
-              <w:pStyle w:val="BDOITable"/>
-            </w:pPr>
-            <w:r>
-              <w:rPr>
-                <w:sz w:val="17"/>
-              </w:rPr>
-              <w:t>DIS 3.29.0</w:t>
-            </w:r>
-          </w:p>
-        </w:tc>
-        <w:tc>
-          <w:tcPr>
-            <w:tcW w:type="dxa" w:w="2163"/>
-            <w:tcMar>
-              <w:top w:w="50" w:type="dxa"/>
-              <w:bottom w:w="50" w:type="dxa"/>
-              <w:left w:w="90" w:type="dxa"/>
-              <w:right w:w="90" w:type="dxa"/>
-            </w:tcMar>
-            <w:shd w:val="clear" w:color="auto" w:fill="E5F5FF"/>
-          </w:tcPr>
-          <w:p>
-            <w:pPr>
-              <w:pStyle w:val="BDOITable"/>
-            </w:pPr>
-            <w:r>
-              <w:rPr>
-                <w:sz w:val="17"/>
-              </w:rPr>
-              <w:t>Volume 2, FR-DS-092</w:t>
+              <w:t>39</w:t>
             </w:r>
           </w:p>
         </w:tc>
@@ -4662,7 +3982,7 @@
           <w:b/>
           <w:i w:val="0"/>
         </w:rPr>
-        <w:t xml:space="preserve">Table 5: </w:t>
+        <w:t xml:space="preserve">Table 4: </w:t>
       </w:r>
       <w:r>
         <w:rPr/>
@@ -4685,10 +4005,9 @@
         <w:tblLayout w:type="fixed"/>
       </w:tblPr>
       <w:tblGrid>
-        <w:gridCol w:w="679"/>
-        <w:gridCol w:w="4193"/>
-        <w:gridCol w:w="2039"/>
-        <w:gridCol w:w="3059"/>
+        <w:gridCol w:w="720"/>
+        <w:gridCol w:w="6849"/>
+        <w:gridCol w:w="2403"/>
       </w:tblGrid>
       <w:tr>
         <w:trPr>
@@ -4697,7 +4016,7 @@
         </w:trPr>
         <w:tc>
           <w:tcPr>
-            <w:tcW w:type="dxa" w:w="680"/>
+            <w:tcW w:type="dxa" w:w="721"/>
             <w:shd w:val="clear" w:color="auto" w:fill="004EA8"/>
             <w:tcMar>
               <w:top w:w="50" w:type="dxa"/>
@@ -4723,7 +4042,7 @@
         </w:tc>
         <w:tc>
           <w:tcPr>
-            <w:tcW w:type="dxa" w:w="4193"/>
+            <w:tcW w:type="dxa" w:w="6848"/>
             <w:shd w:val="clear" w:color="auto" w:fill="004EA8"/>
             <w:tcMar>
               <w:top w:w="50" w:type="dxa"/>
@@ -4749,7 +4068,7 @@
         </w:tc>
         <w:tc>
           <w:tcPr>
-            <w:tcW w:type="dxa" w:w="2040"/>
+            <w:tcW w:type="dxa" w:w="2403"/>
             <w:shd w:val="clear" w:color="auto" w:fill="004EA8"/>
             <w:tcMar>
               <w:top w:w="50" w:type="dxa"/>
@@ -4773,32 +4092,6 @@
             </w:r>
           </w:p>
         </w:tc>
-        <w:tc>
-          <w:tcPr>
-            <w:tcW w:type="dxa" w:w="3060"/>
-            <w:shd w:val="clear" w:color="auto" w:fill="004EA8"/>
-            <w:tcMar>
-              <w:top w:w="50" w:type="dxa"/>
-              <w:bottom w:w="50" w:type="dxa"/>
-              <w:left w:w="90" w:type="dxa"/>
-              <w:right w:w="90" w:type="dxa"/>
-            </w:tcMar>
-            <w:vAlign w:val="center"/>
-          </w:tcPr>
-          <w:p>
-            <w:pPr>
-              <w:pStyle w:val="BDOITableHeader"/>
-            </w:pPr>
-            <w:r>
-              <w:rPr>
-                <w:b/>
-                <w:color w:val="FFFFFF"/>
-                <w:sz w:val="18"/>
-              </w:rPr>
-              <w:t>Location</w:t>
-            </w:r>
-          </w:p>
-        </w:tc>
       </w:tr>
       <w:tr>
         <w:trPr>
@@ -4806,7 +4099,7 @@
         </w:trPr>
         <w:tc>
           <w:tcPr>
-            <w:tcW w:type="dxa" w:w="680"/>
+            <w:tcW w:type="dxa" w:w="721"/>
             <w:tcMar>
               <w:top w:w="50" w:type="dxa"/>
               <w:bottom w:w="50" w:type="dxa"/>
@@ -4828,7 +4121,7 @@
         </w:tc>
         <w:tc>
           <w:tcPr>
-            <w:tcW w:type="dxa" w:w="4193"/>
+            <w:tcW w:type="dxa" w:w="6848"/>
             <w:tcMar>
               <w:top w:w="50" w:type="dxa"/>
               <w:bottom w:w="50" w:type="dxa"/>
@@ -4850,7 +4143,7 @@
         </w:tc>
         <w:tc>
           <w:tcPr>
-            <w:tcW w:type="dxa" w:w="2040"/>
+            <w:tcW w:type="dxa" w:w="2403"/>
             <w:tcMar>
               <w:top w:w="50" w:type="dxa"/>
               <w:bottom w:w="50" w:type="dxa"/>
@@ -4870,30 +4163,6 @@
             </w:r>
           </w:p>
         </w:tc>
-        <w:tc>
-          <w:tcPr>
-            <w:tcW w:type="dxa" w:w="3060"/>
-            <w:tcMar>
-              <w:top w:w="50" w:type="dxa"/>
-              <w:bottom w:w="50" w:type="dxa"/>
-              <w:left w:w="90" w:type="dxa"/>
-              <w:right w:w="90" w:type="dxa"/>
-            </w:tcMar>
-          </w:tcPr>
-          <w:p>
-            <w:pPr>
-              <w:pStyle w:val="BDOITable"/>
-            </w:pPr>
-            <w:r>
-              <w:rPr>
-                <w:rFonts w:ascii="Courier New" w:hAnsi="Courier New" w:cs="Courier New" w:eastAsia="Courier New"/>
-                <w:color w:val="2E2E2E"/>
-                <w:sz w:val="16"/>
-              </w:rPr>
-              <w:t>docs/source-documents/Accounting, Disbursement, and Accounting Controls and Subsidiary Ledger BRD.zip</w:t>
-            </w:r>
-          </w:p>
-        </w:tc>
       </w:tr>
       <w:tr>
         <w:trPr>
@@ -4901,7 +4170,7 @@
         </w:trPr>
         <w:tc>
           <w:tcPr>
-            <w:tcW w:type="dxa" w:w="680"/>
+            <w:tcW w:type="dxa" w:w="721"/>
             <w:tcMar>
               <w:top w:w="50" w:type="dxa"/>
               <w:bottom w:w="50" w:type="dxa"/>
@@ -4924,7 +4193,7 @@
         </w:tc>
         <w:tc>
           <w:tcPr>
-            <w:tcW w:type="dxa" w:w="4193"/>
+            <w:tcW w:type="dxa" w:w="6848"/>
             <w:tcMar>
               <w:top w:w="50" w:type="dxa"/>
               <w:bottom w:w="50" w:type="dxa"/>
@@ -4947,7 +4216,7 @@
         </w:tc>
         <w:tc>
           <w:tcPr>
-            <w:tcW w:type="dxa" w:w="2040"/>
+            <w:tcW w:type="dxa" w:w="2403"/>
             <w:tcMar>
               <w:top w:w="50" w:type="dxa"/>
               <w:bottom w:w="50" w:type="dxa"/>
@@ -4968,29 +4237,6 @@
             </w:r>
           </w:p>
         </w:tc>
-        <w:tc>
-          <w:tcPr>
-            <w:tcW w:type="dxa" w:w="3060"/>
-            <w:tcMar>
-              <w:top w:w="50" w:type="dxa"/>
-              <w:bottom w:w="50" w:type="dxa"/>
-              <w:left w:w="90" w:type="dxa"/>
-              <w:right w:w="90" w:type="dxa"/>
-            </w:tcMar>
-            <w:shd w:val="clear" w:color="auto" w:fill="E5F5FF"/>
-          </w:tcPr>
-          <w:p>
-            <w:pPr>
-              <w:pStyle w:val="BDOITable"/>
-            </w:pPr>
-            <w:r>
-              <w:rPr>
-                <w:sz w:val="18"/>
-              </w:rPr>
-              <w:t>same file</w:t>
-            </w:r>
-          </w:p>
-        </w:tc>
       </w:tr>
       <w:tr>
         <w:trPr>
@@ -4998,7 +4244,7 @@
         </w:trPr>
         <w:tc>
           <w:tcPr>
-            <w:tcW w:type="dxa" w:w="680"/>
+            <w:tcW w:type="dxa" w:w="721"/>
             <w:tcMar>
               <w:top w:w="50" w:type="dxa"/>
               <w:bottom w:w="50" w:type="dxa"/>
@@ -5020,7 +4266,7 @@
         </w:tc>
         <w:tc>
           <w:tcPr>
-            <w:tcW w:type="dxa" w:w="4193"/>
+            <w:tcW w:type="dxa" w:w="6848"/>
             <w:tcMar>
               <w:top w:w="50" w:type="dxa"/>
               <w:bottom w:w="50" w:type="dxa"/>
@@ -5042,7 +4288,7 @@
         </w:tc>
         <w:tc>
           <w:tcPr>
-            <w:tcW w:type="dxa" w:w="2040"/>
+            <w:tcW w:type="dxa" w:w="2403"/>
             <w:tcMar>
               <w:top w:w="50" w:type="dxa"/>
               <w:bottom w:w="50" w:type="dxa"/>
@@ -5062,28 +4308,6 @@
             </w:r>
           </w:p>
         </w:tc>
-        <w:tc>
-          <w:tcPr>
-            <w:tcW w:type="dxa" w:w="3060"/>
-            <w:tcMar>
-              <w:top w:w="50" w:type="dxa"/>
-              <w:bottom w:w="50" w:type="dxa"/>
-              <w:left w:w="90" w:type="dxa"/>
-              <w:right w:w="90" w:type="dxa"/>
-            </w:tcMar>
-          </w:tcPr>
-          <w:p>
-            <w:pPr>
-              <w:pStyle w:val="BDOITable"/>
-            </w:pPr>
-            <w:r>
-              <w:rPr>
-                <w:sz w:val="18"/>
-              </w:rPr>
-              <w:t>same file</w:t>
-            </w:r>
-          </w:p>
-        </w:tc>
       </w:tr>
       <w:tr>
         <w:trPr>
@@ -5091,7 +4315,7 @@
         </w:trPr>
         <w:tc>
           <w:tcPr>
-            <w:tcW w:type="dxa" w:w="680"/>
+            <w:tcW w:type="dxa" w:w="721"/>
             <w:tcMar>
               <w:top w:w="50" w:type="dxa"/>
               <w:bottom w:w="50" w:type="dxa"/>
@@ -5114,7 +4338,7 @@
         </w:tc>
         <w:tc>
           <w:tcPr>
-            <w:tcW w:type="dxa" w:w="4193"/>
+            <w:tcW w:type="dxa" w:w="6848"/>
             <w:tcMar>
               <w:top w:w="50" w:type="dxa"/>
               <w:bottom w:w="50" w:type="dxa"/>
@@ -5131,13 +4355,13 @@
               <w:rPr>
                 <w:sz w:val="18"/>
               </w:rPr>
-              <w:t>BRD-5 requirements baseline and fit/gap</w:t>
+              <w:t>BRD-5 requirements baseline</w:t>
             </w:r>
           </w:p>
         </w:tc>
         <w:tc>
           <w:tcPr>
-            <w:tcW w:type="dxa" w:w="2040"/>
+            <w:tcW w:type="dxa" w:w="2403"/>
             <w:tcMar>
               <w:top w:w="50" w:type="dxa"/>
               <w:bottom w:w="50" w:type="dxa"/>
@@ -5158,31 +4382,6 @@
             </w:r>
           </w:p>
         </w:tc>
-        <w:tc>
-          <w:tcPr>
-            <w:tcW w:type="dxa" w:w="3060"/>
-            <w:tcMar>
-              <w:top w:w="50" w:type="dxa"/>
-              <w:bottom w:w="50" w:type="dxa"/>
-              <w:left w:w="90" w:type="dxa"/>
-              <w:right w:w="90" w:type="dxa"/>
-            </w:tcMar>
-            <w:shd w:val="clear" w:color="auto" w:fill="E5F5FF"/>
-          </w:tcPr>
-          <w:p>
-            <w:pPr>
-              <w:pStyle w:val="BDOITable"/>
-            </w:pPr>
-            <w:r>
-              <w:rPr>
-                <w:rFonts w:ascii="Courier New" w:hAnsi="Courier New" w:cs="Courier New" w:eastAsia="Courier New"/>
-                <w:color w:val="2E2E2E"/>
-                <w:sz w:val="16"/>
-              </w:rPr>
-              <w:t>docs/requirements/BDOI_ACCT_BRD_SPEC.md</w:t>
-            </w:r>
-          </w:p>
-        </w:tc>
       </w:tr>
       <w:tr>
         <w:trPr>
@@ -5190,7 +4389,7 @@
         </w:trPr>
         <w:tc>
           <w:tcPr>
-            <w:tcW w:type="dxa" w:w="680"/>
+            <w:tcW w:type="dxa" w:w="721"/>
             <w:tcMar>
               <w:top w:w="50" w:type="dxa"/>
               <w:bottom w:w="50" w:type="dxa"/>
@@ -5206,13 +4405,13 @@
               <w:rPr>
                 <w:sz w:val="18"/>
               </w:rPr>
-              <w:t>R5</w:t>
+              <w:t>R6</w:t>
             </w:r>
           </w:p>
         </w:tc>
         <w:tc>
           <w:tcPr>
-            <w:tcW w:type="dxa" w:w="4193"/>
+            <w:tcW w:type="dxa" w:w="6848"/>
             <w:tcMar>
               <w:top w:w="50" w:type="dxa"/>
               <w:bottom w:w="50" w:type="dxa"/>
@@ -5228,13 +4427,13 @@
               <w:rPr>
                 <w:sz w:val="18"/>
               </w:rPr>
-              <w:t>Accounting, Disbursement and ACSL build design with the as-built notes</w:t>
+              <w:t>Cross-BRD decisions and answered questions</w:t>
             </w:r>
           </w:p>
         </w:tc>
         <w:tc>
           <w:tcPr>
-            <w:tcW w:type="dxa" w:w="2040"/>
+            <w:tcW w:type="dxa" w:w="2403"/>
             <w:tcMar>
               <w:top w:w="50" w:type="dxa"/>
               <w:bottom w:w="50" w:type="dxa"/>
@@ -5251,129 +4450,6 @@
                 <w:sz w:val="18"/>
               </w:rPr>
               <w:t>current</w:t>
-            </w:r>
-          </w:p>
-        </w:tc>
-        <w:tc>
-          <w:tcPr>
-            <w:tcW w:type="dxa" w:w="3060"/>
-            <w:tcMar>
-              <w:top w:w="50" w:type="dxa"/>
-              <w:bottom w:w="50" w:type="dxa"/>
-              <w:left w:w="90" w:type="dxa"/>
-              <w:right w:w="90" w:type="dxa"/>
-            </w:tcMar>
-          </w:tcPr>
-          <w:p>
-            <w:pPr>
-              <w:pStyle w:val="BDOITable"/>
-            </w:pPr>
-            <w:r>
-              <w:rPr>
-                <w:rFonts w:ascii="Courier New" w:hAnsi="Courier New" w:cs="Courier New" w:eastAsia="Courier New"/>
-                <w:color w:val="2E2E2E"/>
-                <w:sz w:val="16"/>
-              </w:rPr>
-              <w:t>docs/architecture/ACCOUNTING_DISBURSEMENT_DESIGN.md</w:t>
-            </w:r>
-          </w:p>
-        </w:tc>
-      </w:tr>
-      <w:tr>
-        <w:trPr>
-          <w:cantSplit w:val="true"/>
-        </w:trPr>
-        <w:tc>
-          <w:tcPr>
-            <w:tcW w:type="dxa" w:w="680"/>
-            <w:tcMar>
-              <w:top w:w="50" w:type="dxa"/>
-              <w:bottom w:w="50" w:type="dxa"/>
-              <w:left w:w="90" w:type="dxa"/>
-              <w:right w:w="90" w:type="dxa"/>
-            </w:tcMar>
-            <w:shd w:val="clear" w:color="auto" w:fill="E5F5FF"/>
-          </w:tcPr>
-          <w:p>
-            <w:pPr>
-              <w:pStyle w:val="BDOITable"/>
-            </w:pPr>
-            <w:r>
-              <w:rPr>
-                <w:sz w:val="18"/>
-              </w:rPr>
-              <w:t>R6</w:t>
-            </w:r>
-          </w:p>
-        </w:tc>
-        <w:tc>
-          <w:tcPr>
-            <w:tcW w:type="dxa" w:w="4193"/>
-            <w:tcMar>
-              <w:top w:w="50" w:type="dxa"/>
-              <w:bottom w:w="50" w:type="dxa"/>
-              <w:left w:w="90" w:type="dxa"/>
-              <w:right w:w="90" w:type="dxa"/>
-            </w:tcMar>
-            <w:shd w:val="clear" w:color="auto" w:fill="E5F5FF"/>
-          </w:tcPr>
-          <w:p>
-            <w:pPr>
-              <w:pStyle w:val="BDOITable"/>
-            </w:pPr>
-            <w:r>
-              <w:rPr>
-                <w:sz w:val="18"/>
-              </w:rPr>
-              <w:t>Cross-BRD decisions and answered questions</w:t>
-            </w:r>
-          </w:p>
-        </w:tc>
-        <w:tc>
-          <w:tcPr>
-            <w:tcW w:type="dxa" w:w="2040"/>
-            <w:tcMar>
-              <w:top w:w="50" w:type="dxa"/>
-              <w:bottom w:w="50" w:type="dxa"/>
-              <w:left w:w="90" w:type="dxa"/>
-              <w:right w:w="90" w:type="dxa"/>
-            </w:tcMar>
-            <w:shd w:val="clear" w:color="auto" w:fill="E5F5FF"/>
-          </w:tcPr>
-          <w:p>
-            <w:pPr>
-              <w:pStyle w:val="BDOITable"/>
-            </w:pPr>
-            <w:r>
-              <w:rPr>
-                <w:sz w:val="18"/>
-              </w:rPr>
-              <w:t>current</w:t>
-            </w:r>
-          </w:p>
-        </w:tc>
-        <w:tc>
-          <w:tcPr>
-            <w:tcW w:type="dxa" w:w="3060"/>
-            <w:tcMar>
-              <w:top w:w="50" w:type="dxa"/>
-              <w:bottom w:w="50" w:type="dxa"/>
-              <w:left w:w="90" w:type="dxa"/>
-              <w:right w:w="90" w:type="dxa"/>
-            </w:tcMar>
-            <w:shd w:val="clear" w:color="auto" w:fill="E5F5FF"/>
-          </w:tcPr>
-          <w:p>
-            <w:pPr>
-              <w:pStyle w:val="BDOITable"/>
-            </w:pPr>
-            <w:r>
-              <w:rPr>
-                <w:rFonts w:ascii="Courier New" w:hAnsi="Courier New" w:cs="Courier New" w:eastAsia="Courier New"/>
-                <w:color w:val="2E2E2E"/>
-                <w:sz w:val="16"/>
-              </w:rPr>
-              <w:t>docs/requirements/BDOI_CROSS_BRD_DECISIONS.md</w:t>
             </w:r>
           </w:p>
         </w:tc>
@@ -5416,7 +4492,7 @@
           <w:b/>
           <w:i w:val="0"/>
         </w:rPr>
-        <w:t xml:space="preserve">Table 6: </w:t>
+        <w:t xml:space="preserve">Table 5: </w:t>
       </w:r>
       <w:r>
         <w:rPr/>

</xml_diff>